<commit_message>
Update a la documentación
</commit_message>
<xml_diff>
--- a/Documentos/Anticithera_Definicion_v3.docx
+++ b/Documentos/Anticithera_Definicion_v3.docx
@@ -226,7 +226,7 @@
           <w:r>
             <w:fldChar w:fldCharType="separate"/>
           </w:r>
-          <w:hyperlink w:anchor="_Toc230807888" w:history="1">
+          <w:hyperlink w:anchor="_Toc230985683" w:history="1">
             <w:r>
               <w:rPr>
                 <w:rStyle w:val="Hipervnculo"/>
@@ -271,7 +271,7 @@
                 <w:noProof/>
                 <w:webHidden/>
               </w:rPr>
-              <w:instrText xml:space="preserve"> PAGEREF _Toc230807888 \h </w:instrText>
+              <w:instrText xml:space="preserve"> PAGEREF _Toc230985683 \h </w:instrText>
             </w:r>
             <w:r>
               <w:rPr>
@@ -317,7 +317,7 @@
               <w14:ligatures w14:val="standardContextual"/>
             </w:rPr>
           </w:pPr>
-          <w:hyperlink w:anchor="_Toc230807889" w:history="1">
+          <w:hyperlink w:anchor="_Toc230985684" w:history="1">
             <w:r>
               <w:rPr>
                 <w:rStyle w:val="Hipervnculo"/>
@@ -344,7 +344,7 @@
                 <w:noProof/>
                 <w:webHidden/>
               </w:rPr>
-              <w:instrText xml:space="preserve"> PAGEREF _Toc230807889 \h </w:instrText>
+              <w:instrText xml:space="preserve"> PAGEREF _Toc230985684 \h </w:instrText>
             </w:r>
             <w:r>
               <w:rPr>
@@ -390,7 +390,7 @@
               <w14:ligatures w14:val="standardContextual"/>
             </w:rPr>
           </w:pPr>
-          <w:hyperlink w:anchor="_Toc230807890" w:history="1">
+          <w:hyperlink w:anchor="_Toc230985685" w:history="1">
             <w:r>
               <w:rPr>
                 <w:rStyle w:val="Hipervnculo"/>
@@ -417,7 +417,7 @@
                 <w:noProof/>
                 <w:webHidden/>
               </w:rPr>
-              <w:instrText xml:space="preserve"> PAGEREF _Toc230807890 \h </w:instrText>
+              <w:instrText xml:space="preserve"> PAGEREF _Toc230985685 \h </w:instrText>
             </w:r>
             <w:r>
               <w:rPr>
@@ -463,7 +463,7 @@
               <w14:ligatures w14:val="standardContextual"/>
             </w:rPr>
           </w:pPr>
-          <w:hyperlink w:anchor="_Toc230807891" w:history="1">
+          <w:hyperlink w:anchor="_Toc230985686" w:history="1">
             <w:r>
               <w:rPr>
                 <w:rStyle w:val="Hipervnculo"/>
@@ -490,7 +490,7 @@
                 <w:noProof/>
                 <w:webHidden/>
               </w:rPr>
-              <w:instrText xml:space="preserve"> PAGEREF _Toc230807891 \h </w:instrText>
+              <w:instrText xml:space="preserve"> PAGEREF _Toc230985686 \h </w:instrText>
             </w:r>
             <w:r>
               <w:rPr>
@@ -536,7 +536,7 @@
               <w14:ligatures w14:val="standardContextual"/>
             </w:rPr>
           </w:pPr>
-          <w:hyperlink w:anchor="_Toc230807892" w:history="1">
+          <w:hyperlink w:anchor="_Toc230985687" w:history="1">
             <w:r>
               <w:rPr>
                 <w:rStyle w:val="Hipervnculo"/>
@@ -563,7 +563,7 @@
                 <w:noProof/>
                 <w:webHidden/>
               </w:rPr>
-              <w:instrText xml:space="preserve"> PAGEREF _Toc230807892 \h </w:instrText>
+              <w:instrText xml:space="preserve"> PAGEREF _Toc230985687 \h </w:instrText>
             </w:r>
             <w:r>
               <w:rPr>
@@ -609,7 +609,7 @@
               <w14:ligatures w14:val="standardContextual"/>
             </w:rPr>
           </w:pPr>
-          <w:hyperlink w:anchor="_Toc230807893" w:history="1">
+          <w:hyperlink w:anchor="_Toc230985688" w:history="1">
             <w:r>
               <w:rPr>
                 <w:rStyle w:val="Hipervnculo"/>
@@ -636,7 +636,7 @@
                 <w:noProof/>
                 <w:webHidden/>
               </w:rPr>
-              <w:instrText xml:space="preserve"> PAGEREF _Toc230807893 \h </w:instrText>
+              <w:instrText xml:space="preserve"> PAGEREF _Toc230985688 \h </w:instrText>
             </w:r>
             <w:r>
               <w:rPr>
@@ -682,7 +682,7 @@
               <w14:ligatures w14:val="standardContextual"/>
             </w:rPr>
           </w:pPr>
-          <w:hyperlink w:anchor="_Toc230807894" w:history="1">
+          <w:hyperlink w:anchor="_Toc230985689" w:history="1">
             <w:r>
               <w:rPr>
                 <w:rStyle w:val="Hipervnculo"/>
@@ -710,7 +710,7 @@
                 <w:noProof/>
                 <w:webHidden/>
               </w:rPr>
-              <w:instrText xml:space="preserve"> PAGEREF _Toc230807894 \h </w:instrText>
+              <w:instrText xml:space="preserve"> PAGEREF _Toc230985689 \h </w:instrText>
             </w:r>
             <w:r>
               <w:rPr>
@@ -756,7 +756,7 @@
               <w14:ligatures w14:val="standardContextual"/>
             </w:rPr>
           </w:pPr>
-          <w:hyperlink w:anchor="_Toc230807895" w:history="1">
+          <w:hyperlink w:anchor="_Toc230985690" w:history="1">
             <w:r>
               <w:rPr>
                 <w:rStyle w:val="Hipervnculo"/>
@@ -783,7 +783,7 @@
                 <w:noProof/>
                 <w:webHidden/>
               </w:rPr>
-              <w:instrText xml:space="preserve"> PAGEREF _Toc230807895 \h </w:instrText>
+              <w:instrText xml:space="preserve"> PAGEREF _Toc230985690 \h </w:instrText>
             </w:r>
             <w:r>
               <w:rPr>
@@ -829,7 +829,7 @@
               <w14:ligatures w14:val="standardContextual"/>
             </w:rPr>
           </w:pPr>
-          <w:hyperlink w:anchor="_Toc230807896" w:history="1">
+          <w:hyperlink w:anchor="_Toc230985691" w:history="1">
             <w:r>
               <w:rPr>
                 <w:rStyle w:val="Hipervnculo"/>
@@ -856,7 +856,7 @@
                 <w:noProof/>
                 <w:webHidden/>
               </w:rPr>
-              <w:instrText xml:space="preserve"> PAGEREF _Toc230807896 \h </w:instrText>
+              <w:instrText xml:space="preserve"> PAGEREF _Toc230985691 \h </w:instrText>
             </w:r>
             <w:r>
               <w:rPr>
@@ -902,7 +902,7 @@
               <w14:ligatures w14:val="standardContextual"/>
             </w:rPr>
           </w:pPr>
-          <w:hyperlink w:anchor="_Toc230807897" w:history="1">
+          <w:hyperlink w:anchor="_Toc230985692" w:history="1">
             <w:r>
               <w:rPr>
                 <w:rStyle w:val="Hipervnculo"/>
@@ -929,7 +929,7 @@
                 <w:noProof/>
                 <w:webHidden/>
               </w:rPr>
-              <w:instrText xml:space="preserve"> PAGEREF _Toc230807897 \h </w:instrText>
+              <w:instrText xml:space="preserve"> PAGEREF _Toc230985692 \h </w:instrText>
             </w:r>
             <w:r>
               <w:rPr>
@@ -975,7 +975,7 @@
               <w14:ligatures w14:val="standardContextual"/>
             </w:rPr>
           </w:pPr>
-          <w:hyperlink w:anchor="_Toc230807898" w:history="1">
+          <w:hyperlink w:anchor="_Toc230985693" w:history="1">
             <w:r>
               <w:rPr>
                 <w:rStyle w:val="Hipervnculo"/>
@@ -1002,7 +1002,7 @@
                 <w:noProof/>
                 <w:webHidden/>
               </w:rPr>
-              <w:instrText xml:space="preserve"> PAGEREF _Toc230807898 \h </w:instrText>
+              <w:instrText xml:space="preserve"> PAGEREF _Toc230985693 \h </w:instrText>
             </w:r>
             <w:r>
               <w:rPr>
@@ -1048,7 +1048,7 @@
               <w14:ligatures w14:val="standardContextual"/>
             </w:rPr>
           </w:pPr>
-          <w:hyperlink w:anchor="_Toc230807899" w:history="1">
+          <w:hyperlink w:anchor="_Toc230985694" w:history="1">
             <w:r>
               <w:rPr>
                 <w:rStyle w:val="Hipervnculo"/>
@@ -1075,7 +1075,7 @@
                 <w:noProof/>
                 <w:webHidden/>
               </w:rPr>
-              <w:instrText xml:space="preserve"> PAGEREF _Toc230807899 \h </w:instrText>
+              <w:instrText xml:space="preserve"> PAGEREF _Toc230985694 \h </w:instrText>
             </w:r>
             <w:r>
               <w:rPr>
@@ -1121,7 +1121,7 @@
               <w14:ligatures w14:val="standardContextual"/>
             </w:rPr>
           </w:pPr>
-          <w:hyperlink w:anchor="_Toc230807900" w:history="1">
+          <w:hyperlink w:anchor="_Toc230985695" w:history="1">
             <w:r>
               <w:rPr>
                 <w:rStyle w:val="Hipervnculo"/>
@@ -1148,7 +1148,7 @@
                 <w:noProof/>
                 <w:webHidden/>
               </w:rPr>
-              <w:instrText xml:space="preserve"> PAGEREF _Toc230807900 \h </w:instrText>
+              <w:instrText xml:space="preserve"> PAGEREF _Toc230985695 \h </w:instrText>
             </w:r>
             <w:r>
               <w:rPr>
@@ -1169,6 +1169,152 @@
                 <w:webHidden/>
               </w:rPr>
               <w:t>6</w:t>
+            </w:r>
+            <w:r>
+              <w:rPr>
+                <w:noProof/>
+                <w:webHidden/>
+              </w:rPr>
+              <w:fldChar w:fldCharType="end"/>
+            </w:r>
+          </w:hyperlink>
+        </w:p>
+        <w:p>
+          <w:pPr>
+            <w:pStyle w:val="TDC1"/>
+            <w:tabs>
+              <w:tab w:val="right" w:leader="dot" w:pos="9350"/>
+            </w:tabs>
+            <w:rPr>
+              <w:rFonts w:asciiTheme="minorHAnsi" w:eastAsiaTheme="minorEastAsia" w:hAnsiTheme="minorHAnsi" w:cstheme="minorBidi"/>
+              <w:noProof/>
+              <w:kern w:val="2"/>
+              <w:sz w:val="24"/>
+              <w:szCs w:val="24"/>
+              <w14:ligatures w14:val="standardContextual"/>
+            </w:rPr>
+          </w:pPr>
+          <w:hyperlink w:anchor="_Toc230985696" w:history="1">
+            <w:r>
+              <w:rPr>
+                <w:rStyle w:val="Hipervnculo"/>
+                <w:noProof/>
+              </w:rPr>
+              <w:t>5. Diagramas de caso de uso</w:t>
+            </w:r>
+            <w:r>
+              <w:rPr>
+                <w:noProof/>
+                <w:webHidden/>
+              </w:rPr>
+              <w:tab/>
+            </w:r>
+            <w:r>
+              <w:rPr>
+                <w:noProof/>
+                <w:webHidden/>
+              </w:rPr>
+              <w:fldChar w:fldCharType="begin"/>
+            </w:r>
+            <w:r>
+              <w:rPr>
+                <w:noProof/>
+                <w:webHidden/>
+              </w:rPr>
+              <w:instrText xml:space="preserve"> PAGEREF _Toc230985696 \h </w:instrText>
+            </w:r>
+            <w:r>
+              <w:rPr>
+                <w:noProof/>
+                <w:webHidden/>
+              </w:rPr>
+            </w:r>
+            <w:r>
+              <w:rPr>
+                <w:noProof/>
+                <w:webHidden/>
+              </w:rPr>
+              <w:fldChar w:fldCharType="separate"/>
+            </w:r>
+            <w:r>
+              <w:rPr>
+                <w:noProof/>
+                <w:webHidden/>
+              </w:rPr>
+              <w:t>6</w:t>
+            </w:r>
+            <w:r>
+              <w:rPr>
+                <w:noProof/>
+                <w:webHidden/>
+              </w:rPr>
+              <w:fldChar w:fldCharType="end"/>
+            </w:r>
+          </w:hyperlink>
+        </w:p>
+        <w:p>
+          <w:pPr>
+            <w:pStyle w:val="TDC1"/>
+            <w:tabs>
+              <w:tab w:val="right" w:leader="dot" w:pos="9350"/>
+            </w:tabs>
+            <w:rPr>
+              <w:rFonts w:asciiTheme="minorHAnsi" w:eastAsiaTheme="minorEastAsia" w:hAnsiTheme="minorHAnsi" w:cstheme="minorBidi"/>
+              <w:noProof/>
+              <w:kern w:val="2"/>
+              <w:sz w:val="24"/>
+              <w:szCs w:val="24"/>
+              <w14:ligatures w14:val="standardContextual"/>
+            </w:rPr>
+          </w:pPr>
+          <w:hyperlink w:anchor="_Toc230985697" w:history="1">
+            <w:r>
+              <w:rPr>
+                <w:rStyle w:val="Hipervnculo"/>
+                <w:noProof/>
+              </w:rPr>
+              <w:t>6. Diagrama relacional de DB</w:t>
+            </w:r>
+            <w:r>
+              <w:rPr>
+                <w:noProof/>
+                <w:webHidden/>
+              </w:rPr>
+              <w:tab/>
+            </w:r>
+            <w:r>
+              <w:rPr>
+                <w:noProof/>
+                <w:webHidden/>
+              </w:rPr>
+              <w:fldChar w:fldCharType="begin"/>
+            </w:r>
+            <w:r>
+              <w:rPr>
+                <w:noProof/>
+                <w:webHidden/>
+              </w:rPr>
+              <w:instrText xml:space="preserve"> PAGEREF _Toc230985697 \h </w:instrText>
+            </w:r>
+            <w:r>
+              <w:rPr>
+                <w:noProof/>
+                <w:webHidden/>
+              </w:rPr>
+            </w:r>
+            <w:r>
+              <w:rPr>
+                <w:noProof/>
+                <w:webHidden/>
+              </w:rPr>
+              <w:fldChar w:fldCharType="separate"/>
+            </w:r>
+            <w:r>
+              <w:rPr>
+                <w:noProof/>
+                <w:webHidden/>
+              </w:rPr>
+              <w:t>8</w:t>
             </w:r>
             <w:r>
               <w:rPr>
@@ -1217,7 +1363,7 @@
         </w:numPr>
         <w:jc w:val="both"/>
       </w:pPr>
-      <w:bookmarkStart w:id="0" w:name="_Toc230807888"/>
+      <w:bookmarkStart w:id="0" w:name="_Toc230985683"/>
       <w:r>
         <w:t>Visión General y Concepto Central</w:t>
       </w:r>
@@ -1458,11 +1604,19 @@
           <w:lang w:val="en-US"/>
         </w:rPr>
       </w:pPr>
+      <w:proofErr w:type="spellStart"/>
       <w:r>
         <w:rPr>
           <w:lang w:val="en-US"/>
         </w:rPr>
-        <w:t xml:space="preserve">Despliegue backend: WAR </w:t>
+        <w:t>Despliegue</w:t>
+      </w:r>
+      <w:proofErr w:type="spellEnd"/>
+      <w:r>
+        <w:rPr>
+          <w:lang w:val="en-US"/>
+        </w:rPr>
+        <w:t xml:space="preserve"> backend: WAR </w:t>
       </w:r>
       <w:proofErr w:type="spellStart"/>
       <w:r>
@@ -1587,7 +1741,7 @@
         <w:pStyle w:val="Ttulo1"/>
         <w:jc w:val="both"/>
       </w:pPr>
-      <w:bookmarkStart w:id="1" w:name="_Toc230807889"/>
+      <w:bookmarkStart w:id="1" w:name="_Toc230985684"/>
       <w:r>
         <w:t>2. Módulos Funcionales</w:t>
       </w:r>
@@ -1640,7 +1794,7 @@
         <w:pStyle w:val="Ttulo3"/>
         <w:jc w:val="both"/>
       </w:pPr>
-      <w:bookmarkStart w:id="2" w:name="_Toc230807890"/>
+      <w:bookmarkStart w:id="2" w:name="_Toc230985685"/>
       <w:r>
         <w:t xml:space="preserve">Gestión de </w:t>
       </w:r>
@@ -1835,7 +1989,7 @@
         <w:pStyle w:val="Ttulo3"/>
         <w:jc w:val="both"/>
       </w:pPr>
-      <w:bookmarkStart w:id="3" w:name="_Toc230807891"/>
+      <w:bookmarkStart w:id="3" w:name="_Toc230985686"/>
       <w:r>
         <w:t>Notas de Obsidian (.</w:t>
       </w:r>
@@ -1966,7 +2120,7 @@
         <w:pStyle w:val="Ttulo3"/>
         <w:jc w:val="both"/>
       </w:pPr>
-      <w:bookmarkStart w:id="4" w:name="_Toc230807892"/>
+      <w:bookmarkStart w:id="4" w:name="_Toc230985687"/>
       <w:r>
         <w:t>Documentos Office</w:t>
       </w:r>
@@ -1996,7 +2150,7 @@
         <w:pStyle w:val="Ttulo3"/>
         <w:jc w:val="both"/>
       </w:pPr>
-      <w:bookmarkStart w:id="5" w:name="_Toc230807893"/>
+      <w:bookmarkStart w:id="5" w:name="_Toc230985688"/>
       <w:r>
         <w:t xml:space="preserve">Notebooks </w:t>
       </w:r>
@@ -2058,7 +2212,7 @@
           <w:lang w:val="en-US"/>
         </w:rPr>
       </w:pPr>
-      <w:bookmarkStart w:id="6" w:name="_Toc230807894"/>
+      <w:bookmarkStart w:id="6" w:name="_Toc230985689"/>
       <w:proofErr w:type="spellStart"/>
       <w:r>
         <w:rPr>
@@ -2133,7 +2287,7 @@
         <w:pStyle w:val="Ttulo3"/>
         <w:jc w:val="both"/>
       </w:pPr>
-      <w:bookmarkStart w:id="7" w:name="_Toc230807895"/>
+      <w:bookmarkStart w:id="7" w:name="_Toc230985690"/>
       <w:r>
         <w:t>Sistema de Búsqueda y Filtrado</w:t>
       </w:r>
@@ -2210,7 +2364,7 @@
         <w:pStyle w:val="Ttulo3"/>
         <w:jc w:val="both"/>
       </w:pPr>
-      <w:bookmarkStart w:id="8" w:name="_Toc230807896"/>
+      <w:bookmarkStart w:id="8" w:name="_Toc230985691"/>
       <w:r>
         <w:t xml:space="preserve">Exportación — Formato </w:t>
       </w:r>
@@ -2837,7 +2991,7 @@
         <w:pStyle w:val="Ttulo3"/>
         <w:jc w:val="both"/>
       </w:pPr>
-      <w:bookmarkStart w:id="9" w:name="_Toc230807897"/>
+      <w:bookmarkStart w:id="9" w:name="_Toc230985692"/>
       <w:r>
         <w:t>Estado Bienvenida (sin proyecto activo)</w:t>
       </w:r>
@@ -2899,7 +3053,7 @@
         <w:pStyle w:val="Ttulo3"/>
         <w:jc w:val="both"/>
       </w:pPr>
-      <w:bookmarkStart w:id="10" w:name="_Toc230807898"/>
+      <w:bookmarkStart w:id="10" w:name="_Toc230985693"/>
       <w:r>
         <w:t xml:space="preserve">Estado </w:t>
       </w:r>
@@ -3280,7 +3434,7 @@
         <w:pStyle w:val="Ttulo1"/>
         <w:jc w:val="both"/>
       </w:pPr>
-      <w:bookmarkStart w:id="11" w:name="_Toc230807899"/>
+      <w:bookmarkStart w:id="11" w:name="_Toc230985694"/>
       <w:r>
         <w:t>3. Arquitectura Técnica</w:t>
       </w:r>
@@ -3473,7 +3627,7 @@
         <w:pStyle w:val="Ttulo1"/>
         <w:jc w:val="both"/>
       </w:pPr>
-      <w:bookmarkStart w:id="12" w:name="_Toc230807900"/>
+      <w:bookmarkStart w:id="12" w:name="_Toc230985695"/>
       <w:r>
         <w:lastRenderedPageBreak/>
         <w:t>4. Indicadores de Éxito y Consideraciones Técnicas</w:t>
@@ -3576,6 +3730,737 @@
       </w:pPr>
       <w:r>
         <w:t>Compatibilidad: funcionalidad completa en Chrome/Edge</w:t>
+      </w:r>
+    </w:p>
+    <w:p>
+      <w:pPr>
+        <w:pStyle w:val="Ttulo1"/>
+        <w:jc w:val="both"/>
+      </w:pPr>
+      <w:bookmarkStart w:id="13" w:name="_Toc230985696"/>
+      <w:r>
+        <w:t>5. Diagramas de caso de uso</w:t>
+      </w:r>
+      <w:bookmarkEnd w:id="13"/>
+    </w:p>
+    <w:p>
+      <w:pPr>
+        <w:jc w:val="both"/>
+      </w:pPr>
+      <w:r>
+        <w:rPr>
+          <w:b/>
+          <w:bCs/>
+        </w:rPr>
+        <w:t>Diagrama de caso de uso de usuario</w:t>
+      </w:r>
+    </w:p>
+    <w:p>
+      <w:pPr>
+        <w:jc w:val="both"/>
+      </w:pPr>
+      <w:r>
+        <w:rPr>
+          <w:noProof/>
+        </w:rPr>
+        <w:drawing>
+          <wp:anchor distT="0" distB="0" distL="114300" distR="114300" simplePos="0" relativeHeight="251659264" behindDoc="0" locked="0" layoutInCell="1" allowOverlap="1" wp14:anchorId="1E19FDCF" wp14:editId="79B2F341">
+            <wp:simplePos x="0" y="0"/>
+            <wp:positionH relativeFrom="margin">
+              <wp:align>right</wp:align>
+            </wp:positionH>
+            <wp:positionV relativeFrom="paragraph">
+              <wp:posOffset>97790</wp:posOffset>
+            </wp:positionV>
+            <wp:extent cx="5934075" cy="6267450"/>
+            <wp:effectExtent l="0" t="0" r="9525" b="0"/>
+            <wp:wrapNone/>
+            <wp:docPr id="1892732324" name="Imagen 2"/>
+            <wp:cNvGraphicFramePr>
+              <a:graphicFrameLocks xmlns:a="http://schemas.openxmlformats.org/drawingml/2006/main" noChangeAspect="1"/>
+            </wp:cNvGraphicFramePr>
+            <a:graphic xmlns:a="http://schemas.openxmlformats.org/drawingml/2006/main">
+              <a:graphicData uri="http://schemas.openxmlformats.org/drawingml/2006/picture">
+                <pic:pic xmlns:pic="http://schemas.openxmlformats.org/drawingml/2006/picture">
+                  <pic:nvPicPr>
+                    <pic:cNvPr id="0" name="Picture 2"/>
+                    <pic:cNvPicPr>
+                      <a:picLocks noChangeAspect="1" noChangeArrowheads="1"/>
+                    </pic:cNvPicPr>
+                  </pic:nvPicPr>
+                  <pic:blipFill>
+                    <a:blip r:embed="rId9">
+                      <a:extLst>
+                        <a:ext uri="{28A0092B-C50C-407E-A947-70E740481C1C}">
+                          <a14:useLocalDpi xmlns:a14="http://schemas.microsoft.com/office/drawing/2010/main" val="0"/>
+                        </a:ext>
+                      </a:extLst>
+                    </a:blip>
+                    <a:srcRect/>
+                    <a:stretch>
+                      <a:fillRect/>
+                    </a:stretch>
+                  </pic:blipFill>
+                  <pic:spPr bwMode="auto">
+                    <a:xfrm>
+                      <a:off x="0" y="0"/>
+                      <a:ext cx="5934075" cy="6267450"/>
+                    </a:xfrm>
+                    <a:prstGeom prst="rect">
+                      <a:avLst/>
+                    </a:prstGeom>
+                    <a:noFill/>
+                    <a:ln>
+                      <a:noFill/>
+                    </a:ln>
+                  </pic:spPr>
+                </pic:pic>
+              </a:graphicData>
+            </a:graphic>
+          </wp:anchor>
+        </w:drawing>
+      </w:r>
+    </w:p>
+    <w:p>
+      <w:pPr>
+        <w:jc w:val="both"/>
+      </w:pPr>
+    </w:p>
+    <w:p>
+      <w:pPr>
+        <w:jc w:val="both"/>
+      </w:pPr>
+    </w:p>
+    <w:p>
+      <w:pPr>
+        <w:jc w:val="both"/>
+      </w:pPr>
+    </w:p>
+    <w:p>
+      <w:pPr>
+        <w:jc w:val="both"/>
+      </w:pPr>
+    </w:p>
+    <w:p>
+      <w:pPr>
+        <w:jc w:val="both"/>
+      </w:pPr>
+    </w:p>
+    <w:p>
+      <w:pPr>
+        <w:jc w:val="both"/>
+      </w:pPr>
+    </w:p>
+    <w:p>
+      <w:pPr>
+        <w:jc w:val="both"/>
+      </w:pPr>
+    </w:p>
+    <w:p>
+      <w:pPr>
+        <w:jc w:val="both"/>
+      </w:pPr>
+    </w:p>
+    <w:p>
+      <w:pPr>
+        <w:jc w:val="both"/>
+      </w:pPr>
+    </w:p>
+    <w:p>
+      <w:pPr>
+        <w:jc w:val="both"/>
+      </w:pPr>
+    </w:p>
+    <w:p>
+      <w:pPr>
+        <w:jc w:val="both"/>
+      </w:pPr>
+    </w:p>
+    <w:p>
+      <w:pPr>
+        <w:jc w:val="both"/>
+      </w:pPr>
+    </w:p>
+    <w:p>
+      <w:pPr>
+        <w:jc w:val="both"/>
+      </w:pPr>
+    </w:p>
+    <w:p>
+      <w:pPr>
+        <w:jc w:val="both"/>
+      </w:pPr>
+    </w:p>
+    <w:p>
+      <w:pPr>
+        <w:jc w:val="both"/>
+      </w:pPr>
+    </w:p>
+    <w:p>
+      <w:pPr>
+        <w:jc w:val="both"/>
+      </w:pPr>
+    </w:p>
+    <w:p>
+      <w:pPr>
+        <w:jc w:val="both"/>
+      </w:pPr>
+    </w:p>
+    <w:p>
+      <w:pPr>
+        <w:jc w:val="both"/>
+      </w:pPr>
+    </w:p>
+    <w:p>
+      <w:pPr>
+        <w:jc w:val="both"/>
+      </w:pPr>
+    </w:p>
+    <w:p>
+      <w:pPr>
+        <w:jc w:val="both"/>
+      </w:pPr>
+    </w:p>
+    <w:p>
+      <w:pPr>
+        <w:jc w:val="both"/>
+      </w:pPr>
+    </w:p>
+    <w:p>
+      <w:pPr>
+        <w:jc w:val="both"/>
+      </w:pPr>
+    </w:p>
+    <w:p>
+      <w:pPr>
+        <w:jc w:val="both"/>
+      </w:pPr>
+    </w:p>
+    <w:p>
+      <w:pPr>
+        <w:jc w:val="both"/>
+      </w:pPr>
+    </w:p>
+    <w:p>
+      <w:pPr>
+        <w:jc w:val="both"/>
+      </w:pPr>
+    </w:p>
+    <w:p>
+      <w:pPr>
+        <w:jc w:val="both"/>
+      </w:pPr>
+    </w:p>
+    <w:p>
+      <w:pPr>
+        <w:jc w:val="both"/>
+      </w:pPr>
+    </w:p>
+    <w:p>
+      <w:pPr>
+        <w:jc w:val="both"/>
+      </w:pPr>
+    </w:p>
+    <w:p>
+      <w:pPr>
+        <w:jc w:val="both"/>
+      </w:pPr>
+    </w:p>
+    <w:p>
+      <w:pPr>
+        <w:jc w:val="both"/>
+      </w:pPr>
+    </w:p>
+    <w:p>
+      <w:pPr>
+        <w:jc w:val="both"/>
+      </w:pPr>
+    </w:p>
+    <w:p>
+      <w:pPr>
+        <w:jc w:val="both"/>
+      </w:pPr>
+    </w:p>
+    <w:p>
+      <w:pPr>
+        <w:jc w:val="both"/>
+      </w:pPr>
+    </w:p>
+    <w:p>
+      <w:pPr>
+        <w:jc w:val="both"/>
+      </w:pPr>
+    </w:p>
+    <w:p>
+      <w:pPr>
+        <w:jc w:val="both"/>
+      </w:pPr>
+    </w:p>
+    <w:p>
+      <w:pPr>
+        <w:jc w:val="both"/>
+      </w:pPr>
+    </w:p>
+    <w:p>
+      <w:pPr>
+        <w:jc w:val="both"/>
+      </w:pPr>
+    </w:p>
+    <w:p>
+      <w:pPr>
+        <w:jc w:val="both"/>
+      </w:pPr>
+    </w:p>
+    <w:p>
+      <w:pPr>
+        <w:jc w:val="both"/>
+      </w:pPr>
+    </w:p>
+    <w:p>
+      <w:pPr>
+        <w:jc w:val="both"/>
+      </w:pPr>
+    </w:p>
+    <w:p>
+      <w:pPr>
+        <w:jc w:val="both"/>
+      </w:pPr>
+    </w:p>
+    <w:p>
+      <w:pPr>
+        <w:jc w:val="both"/>
+        <w:rPr>
+          <w:b/>
+          <w:bCs/>
+        </w:rPr>
+      </w:pPr>
+      <w:r>
+        <w:rPr>
+          <w:b/>
+          <w:bCs/>
+        </w:rPr>
+        <w:lastRenderedPageBreak/>
+        <w:t>Diagrama de caso de uso del sistema</w:t>
+      </w:r>
+    </w:p>
+    <w:p>
+      <w:pPr>
+        <w:jc w:val="both"/>
+      </w:pPr>
+    </w:p>
+    <w:p>
+      <w:pPr>
+        <w:jc w:val="both"/>
+      </w:pPr>
+      <w:r>
+        <w:rPr>
+          <w:noProof/>
+        </w:rPr>
+        <w:drawing>
+          <wp:anchor distT="0" distB="0" distL="114300" distR="114300" simplePos="0" relativeHeight="251660288" behindDoc="0" locked="0" layoutInCell="1" allowOverlap="1" wp14:anchorId="130DB224" wp14:editId="3293A51C">
+            <wp:simplePos x="0" y="0"/>
+            <wp:positionH relativeFrom="margin">
+              <wp:posOffset>19050</wp:posOffset>
+            </wp:positionH>
+            <wp:positionV relativeFrom="paragraph">
+              <wp:posOffset>107950</wp:posOffset>
+            </wp:positionV>
+            <wp:extent cx="5953125" cy="5524500"/>
+            <wp:effectExtent l="0" t="0" r="9525" b="0"/>
+            <wp:wrapNone/>
+            <wp:docPr id="680826999" name="Imagen 1"/>
+            <wp:cNvGraphicFramePr>
+              <a:graphicFrameLocks xmlns:a="http://schemas.openxmlformats.org/drawingml/2006/main" noChangeAspect="1"/>
+            </wp:cNvGraphicFramePr>
+            <a:graphic xmlns:a="http://schemas.openxmlformats.org/drawingml/2006/main">
+              <a:graphicData uri="http://schemas.openxmlformats.org/drawingml/2006/picture">
+                <pic:pic xmlns:pic="http://schemas.openxmlformats.org/drawingml/2006/picture">
+                  <pic:nvPicPr>
+                    <pic:cNvPr id="0" name="Picture 1"/>
+                    <pic:cNvPicPr>
+                      <a:picLocks noChangeAspect="1" noChangeArrowheads="1"/>
+                    </pic:cNvPicPr>
+                  </pic:nvPicPr>
+                  <pic:blipFill>
+                    <a:blip r:embed="rId10">
+                      <a:extLst>
+                        <a:ext uri="{28A0092B-C50C-407E-A947-70E740481C1C}">
+                          <a14:useLocalDpi xmlns:a14="http://schemas.microsoft.com/office/drawing/2010/main" val="0"/>
+                        </a:ext>
+                      </a:extLst>
+                    </a:blip>
+                    <a:srcRect/>
+                    <a:stretch>
+                      <a:fillRect/>
+                    </a:stretch>
+                  </pic:blipFill>
+                  <pic:spPr bwMode="auto">
+                    <a:xfrm>
+                      <a:off x="0" y="0"/>
+                      <a:ext cx="5953125" cy="5524500"/>
+                    </a:xfrm>
+                    <a:prstGeom prst="rect">
+                      <a:avLst/>
+                    </a:prstGeom>
+                    <a:noFill/>
+                    <a:ln>
+                      <a:noFill/>
+                    </a:ln>
+                  </pic:spPr>
+                </pic:pic>
+              </a:graphicData>
+            </a:graphic>
+          </wp:anchor>
+        </w:drawing>
+      </w:r>
+    </w:p>
+    <w:p>
+      <w:pPr>
+        <w:jc w:val="both"/>
+      </w:pPr>
+    </w:p>
+    <w:p>
+      <w:pPr>
+        <w:jc w:val="both"/>
+      </w:pPr>
+    </w:p>
+    <w:p>
+      <w:pPr>
+        <w:jc w:val="both"/>
+      </w:pPr>
+    </w:p>
+    <w:p>
+      <w:pPr>
+        <w:jc w:val="both"/>
+      </w:pPr>
+    </w:p>
+    <w:p>
+      <w:pPr>
+        <w:jc w:val="both"/>
+      </w:pPr>
+    </w:p>
+    <w:p>
+      <w:pPr>
+        <w:jc w:val="both"/>
+      </w:pPr>
+    </w:p>
+    <w:p>
+      <w:pPr>
+        <w:jc w:val="both"/>
+      </w:pPr>
+    </w:p>
+    <w:p>
+      <w:pPr>
+        <w:jc w:val="both"/>
+      </w:pPr>
+    </w:p>
+    <w:p>
+      <w:pPr>
+        <w:jc w:val="both"/>
+      </w:pPr>
+    </w:p>
+    <w:p>
+      <w:pPr>
+        <w:jc w:val="both"/>
+      </w:pPr>
+    </w:p>
+    <w:p>
+      <w:pPr>
+        <w:jc w:val="both"/>
+      </w:pPr>
+    </w:p>
+    <w:p>
+      <w:pPr>
+        <w:jc w:val="both"/>
+      </w:pPr>
+    </w:p>
+    <w:p>
+      <w:pPr>
+        <w:jc w:val="both"/>
+      </w:pPr>
+    </w:p>
+    <w:p>
+      <w:pPr>
+        <w:jc w:val="both"/>
+      </w:pPr>
+    </w:p>
+    <w:p>
+      <w:pPr>
+        <w:jc w:val="both"/>
+      </w:pPr>
+    </w:p>
+    <w:p>
+      <w:pPr>
+        <w:jc w:val="both"/>
+      </w:pPr>
+    </w:p>
+    <w:p>
+      <w:pPr>
+        <w:jc w:val="both"/>
+      </w:pPr>
+    </w:p>
+    <w:p>
+      <w:pPr>
+        <w:jc w:val="both"/>
+      </w:pPr>
+    </w:p>
+    <w:p>
+      <w:pPr>
+        <w:jc w:val="both"/>
+      </w:pPr>
+    </w:p>
+    <w:p>
+      <w:pPr>
+        <w:jc w:val="both"/>
+      </w:pPr>
+    </w:p>
+    <w:p>
+      <w:pPr>
+        <w:jc w:val="both"/>
+      </w:pPr>
+    </w:p>
+    <w:p>
+      <w:pPr>
+        <w:jc w:val="both"/>
+      </w:pPr>
+    </w:p>
+    <w:p>
+      <w:pPr>
+        <w:jc w:val="both"/>
+      </w:pPr>
+    </w:p>
+    <w:p>
+      <w:pPr>
+        <w:jc w:val="both"/>
+      </w:pPr>
+    </w:p>
+    <w:p>
+      <w:pPr>
+        <w:jc w:val="both"/>
+      </w:pPr>
+    </w:p>
+    <w:p>
+      <w:pPr>
+        <w:jc w:val="both"/>
+      </w:pPr>
+    </w:p>
+    <w:p>
+      <w:pPr>
+        <w:jc w:val="both"/>
+      </w:pPr>
+    </w:p>
+    <w:p>
+      <w:pPr>
+        <w:jc w:val="both"/>
+      </w:pPr>
+    </w:p>
+    <w:p>
+      <w:pPr>
+        <w:jc w:val="both"/>
+      </w:pPr>
+    </w:p>
+    <w:p>
+      <w:pPr>
+        <w:jc w:val="both"/>
+      </w:pPr>
+    </w:p>
+    <w:p>
+      <w:pPr>
+        <w:jc w:val="both"/>
+      </w:pPr>
+    </w:p>
+    <w:p>
+      <w:pPr>
+        <w:jc w:val="both"/>
+      </w:pPr>
+    </w:p>
+    <w:p>
+      <w:pPr>
+        <w:jc w:val="both"/>
+      </w:pPr>
+    </w:p>
+    <w:p>
+      <w:pPr>
+        <w:jc w:val="both"/>
+      </w:pPr>
+    </w:p>
+    <w:p>
+      <w:pPr>
+        <w:jc w:val="both"/>
+      </w:pPr>
+    </w:p>
+    <w:p>
+      <w:pPr>
+        <w:jc w:val="both"/>
+      </w:pPr>
+    </w:p>
+    <w:p>
+      <w:pPr>
+        <w:jc w:val="both"/>
+      </w:pPr>
+    </w:p>
+    <w:p>
+      <w:pPr>
+        <w:jc w:val="both"/>
+      </w:pPr>
+    </w:p>
+    <w:p>
+      <w:pPr>
+        <w:jc w:val="both"/>
+      </w:pPr>
+    </w:p>
+    <w:p>
+      <w:pPr>
+        <w:jc w:val="both"/>
+      </w:pPr>
+    </w:p>
+    <w:p>
+      <w:pPr>
+        <w:jc w:val="both"/>
+      </w:pPr>
+    </w:p>
+    <w:p>
+      <w:pPr>
+        <w:jc w:val="both"/>
+      </w:pPr>
+    </w:p>
+    <w:p>
+      <w:pPr>
+        <w:jc w:val="both"/>
+      </w:pPr>
+    </w:p>
+    <w:p>
+      <w:pPr>
+        <w:jc w:val="both"/>
+      </w:pPr>
+    </w:p>
+    <w:p>
+      <w:pPr>
+        <w:jc w:val="both"/>
+      </w:pPr>
+    </w:p>
+    <w:p>
+      <w:pPr>
+        <w:jc w:val="both"/>
+      </w:pPr>
+    </w:p>
+    <w:p>
+      <w:pPr>
+        <w:jc w:val="both"/>
+      </w:pPr>
+    </w:p>
+    <w:p>
+      <w:pPr>
+        <w:jc w:val="both"/>
+      </w:pPr>
+    </w:p>
+    <w:p>
+      <w:pPr>
+        <w:jc w:val="both"/>
+      </w:pPr>
+    </w:p>
+    <w:p>
+      <w:pPr>
+        <w:jc w:val="both"/>
+      </w:pPr>
+    </w:p>
+    <w:p>
+      <w:pPr>
+        <w:jc w:val="both"/>
+      </w:pPr>
+    </w:p>
+    <w:p>
+      <w:pPr>
+        <w:jc w:val="both"/>
+      </w:pPr>
+    </w:p>
+    <w:p>
+      <w:pPr>
+        <w:jc w:val="both"/>
+      </w:pPr>
+    </w:p>
+    <w:p>
+      <w:pPr>
+        <w:pStyle w:val="Ttulo1"/>
+        <w:jc w:val="both"/>
+      </w:pPr>
+      <w:bookmarkStart w:id="14" w:name="_Toc230985697"/>
+      <w:r>
+        <w:lastRenderedPageBreak/>
+        <w:t>6. Diagrama relacional de DB</w:t>
+      </w:r>
+      <w:bookmarkEnd w:id="14"/>
+    </w:p>
+    <w:p>
+      <w:pPr>
+        <w:jc w:val="both"/>
+      </w:pPr>
+      <w:r>
+        <w:rPr>
+          <w:noProof/>
+        </w:rPr>
+        <w:drawing>
+          <wp:anchor distT="0" distB="0" distL="114300" distR="114300" simplePos="0" relativeHeight="251661312" behindDoc="0" locked="0" layoutInCell="1" allowOverlap="1" wp14:anchorId="1C6A2F55" wp14:editId="7CBF63B2">
+            <wp:simplePos x="0" y="0"/>
+            <wp:positionH relativeFrom="margin">
+              <wp:align>center</wp:align>
+            </wp:positionH>
+            <wp:positionV relativeFrom="paragraph">
+              <wp:posOffset>134620</wp:posOffset>
+            </wp:positionV>
+            <wp:extent cx="6715125" cy="8598109"/>
+            <wp:effectExtent l="0" t="0" r="0" b="0"/>
+            <wp:wrapNone/>
+            <wp:docPr id="1954458881" name="Imagen 3"/>
+            <wp:cNvGraphicFramePr>
+              <a:graphicFrameLocks xmlns:a="http://schemas.openxmlformats.org/drawingml/2006/main" noChangeAspect="1"/>
+            </wp:cNvGraphicFramePr>
+            <a:graphic xmlns:a="http://schemas.openxmlformats.org/drawingml/2006/main">
+              <a:graphicData uri="http://schemas.openxmlformats.org/drawingml/2006/picture">
+                <pic:pic xmlns:pic="http://schemas.openxmlformats.org/drawingml/2006/picture">
+                  <pic:nvPicPr>
+                    <pic:cNvPr id="0" name="Picture 3"/>
+                    <pic:cNvPicPr>
+                      <a:picLocks noChangeAspect="1" noChangeArrowheads="1"/>
+                    </pic:cNvPicPr>
+                  </pic:nvPicPr>
+                  <pic:blipFill>
+                    <a:blip r:embed="rId11" cstate="print">
+                      <a:extLst>
+                        <a:ext uri="{28A0092B-C50C-407E-A947-70E740481C1C}">
+                          <a14:useLocalDpi xmlns:a14="http://schemas.microsoft.com/office/drawing/2010/main" val="0"/>
+                        </a:ext>
+                      </a:extLst>
+                    </a:blip>
+                    <a:srcRect/>
+                    <a:stretch>
+                      <a:fillRect/>
+                    </a:stretch>
+                  </pic:blipFill>
+                  <pic:spPr bwMode="auto">
+                    <a:xfrm>
+                      <a:off x="0" y="0"/>
+                      <a:ext cx="6715260" cy="8598281"/>
+                    </a:xfrm>
+                    <a:prstGeom prst="rect">
+                      <a:avLst/>
+                    </a:prstGeom>
+                    <a:noFill/>
+                    <a:ln>
+                      <a:noFill/>
+                    </a:ln>
+                  </pic:spPr>
+                </pic:pic>
+              </a:graphicData>
+            </a:graphic>
+            <wp14:sizeRelH relativeFrom="margin">
+              <wp14:pctWidth>0</wp14:pctWidth>
+            </wp14:sizeRelH>
+            <wp14:sizeRelV relativeFrom="margin">
+              <wp14:pctHeight>0</wp14:pctHeight>
+            </wp14:sizeRelV>
+          </wp:anchor>
+        </w:drawing>
       </w:r>
     </w:p>
     <w:sectPr>
@@ -5788,9 +6673,11 @@
   <w:style w:type="paragraph" w:default="1" w:styleId="Normal">
     <w:name w:val="Normal"/>
     <w:qFormat/>
+    <w:rsid w:val="00013085"/>
   </w:style>
   <w:style w:type="paragraph" w:styleId="Ttulo1">
     <w:name w:val="heading 1"/>
+    <w:link w:val="Ttulo1Car"/>
     <w:uiPriority w:val="9"/>
     <w:qFormat/>
     <w:pPr>
@@ -6137,6 +7024,20 @@
         <w:shd w:val="clear" w:color="auto" w:fill="F2F2F2" w:themeFill="background1" w:themeFillShade="F2"/>
       </w:tcPr>
     </w:tblStylePr>
+  </w:style>
+  <w:style w:type="character" w:customStyle="1" w:styleId="Ttulo1Car">
+    <w:name w:val="Título 1 Car"/>
+    <w:basedOn w:val="Fuentedeprrafopredeter"/>
+    <w:link w:val="Ttulo1"/>
+    <w:uiPriority w:val="9"/>
+    <w:rsid w:val="00D87C45"/>
+    <w:rPr>
+      <w:b/>
+      <w:bCs/>
+      <w:color w:val="7C4B00"/>
+      <w:sz w:val="32"/>
+      <w:szCs w:val="32"/>
+    </w:rPr>
   </w:style>
 </w:styles>
 </file>

</xml_diff>